<commit_message>
Added smart district extraction logic to DashboardClient
</commit_message>
<xml_diff>
--- a/src/templates/1. WCR_Undertaking_Guarantee_Aadhar.docx
+++ b/src/templates/1. WCR_Undertaking_Guarantee_Aadhar.docx
@@ -472,6 +472,226 @@
       </w:tr>
       <w:tr>
         <w:trPr>
+          <w:trHeight w:val="358"/>
+        </w:trPr>
+        <w:tc>
+          <w:tcPr>
+            <w:tcW w:w="751" w:type="dxa"/>
+            <w:tcBorders>
+              <w:top w:val="single" w:sz="4" w:space="0" w:color="000000"/>
+              <w:left w:val="single" w:sz="4" w:space="0" w:color="000000"/>
+              <w:bottom w:val="single" w:sz="4" w:space="0" w:color="000000"/>
+              <w:right w:val="single" w:sz="4" w:space="0" w:color="000000"/>
+            </w:tcBorders>
+          </w:tcPr>
+          <w:p>
+            <w:pPr>
+              <w:spacing w:after="0" w:line="259" w:lineRule="auto"/>
+              <w:ind w:left="0" w:right="34" w:firstLine="0"/>
+              <w:jc w:val="center"/>
+            </w:pPr>
+            <w:r>
+              <w:t xml:space="preserve">5 </w:t>
+            </w:r>
+          </w:p>
+        </w:tc>
+        <w:tc>
+          <w:tcPr>
+            <w:tcW w:w="5823" w:type="dxa"/>
+            <w:tcBorders>
+              <w:top w:val="single" w:sz="4" w:space="0" w:color="000000"/>
+              <w:left w:val="single" w:sz="4" w:space="0" w:color="000000"/>
+              <w:bottom w:val="single" w:sz="4" w:space="0" w:color="000000"/>
+              <w:right w:val="single" w:sz="4" w:space="0" w:color="000000"/>
+            </w:tcBorders>
+          </w:tcPr>
+          <w:p>
+            <w:pPr>
+              <w:spacing w:after="0" w:line="259" w:lineRule="auto"/>
+              <w:ind w:left="0" w:firstLine="0"/>
+              <w:jc w:val="left"/>
+            </w:pPr>
+            <w:r>
+              <w:t xml:space="preserve">Sanction number </w:t>
+            </w:r>
+          </w:p>
+        </w:tc>
+        <w:tc>
+          <w:tcPr>
+            <w:tcW w:w="3047" w:type="dxa"/>
+            <w:tcBorders>
+              <w:top w:val="single" w:sz="4" w:space="0" w:color="000000"/>
+              <w:left w:val="single" w:sz="4" w:space="0" w:color="000000"/>
+              <w:bottom w:val="single" w:sz="4" w:space="0" w:color="000000"/>
+              <w:right w:val="single" w:sz="4" w:space="0" w:color="000000"/>
+            </w:tcBorders>
+          </w:tcPr>
+          <w:p>
+            <w:pPr>
+              <w:spacing w:after="0" w:line="259" w:lineRule="auto"/>
+              <w:ind w:left="0" w:firstLine="0"/>
+              <w:jc w:val="left"/>
+            </w:pPr>
+            <w:r>
+              <w:t>{{</w:t>
+            </w:r>
+            <w:proofErr w:type="spellStart"/>
+            <w:r>
+              <w:t>sanction_number</w:t>
+            </w:r>
+            <w:proofErr w:type="spellEnd"/>
+            <w:r>
+              <w:t>}}</w:t>
+            </w:r>
+          </w:p>
+        </w:tc>
+      </w:tr>
+      <w:tr>
+        <w:trPr>
+          <w:trHeight w:val="401"/>
+        </w:trPr>
+        <w:tc>
+          <w:tcPr>
+            <w:tcW w:w="751" w:type="dxa"/>
+            <w:vMerge w:val="restart"/>
+            <w:tcBorders>
+              <w:top w:val="single" w:sz="4" w:space="0" w:color="000000"/>
+              <w:left w:val="single" w:sz="4" w:space="0" w:color="000000"/>
+              <w:bottom w:val="single" w:sz="4" w:space="0" w:color="000000"/>
+              <w:right w:val="single" w:sz="4" w:space="0" w:color="000000"/>
+            </w:tcBorders>
+            <w:vAlign w:val="center"/>
+          </w:tcPr>
+          <w:p>
+            <w:pPr>
+              <w:spacing w:after="0" w:line="259" w:lineRule="auto"/>
+              <w:ind w:left="0" w:right="34" w:firstLine="0"/>
+              <w:jc w:val="center"/>
+            </w:pPr>
+            <w:r>
+              <w:t xml:space="preserve">6 </w:t>
+            </w:r>
+          </w:p>
+        </w:tc>
+        <w:tc>
+          <w:tcPr>
+            <w:tcW w:w="5823" w:type="dxa"/>
+            <w:tcBorders>
+              <w:top w:val="single" w:sz="4" w:space="0" w:color="000000"/>
+              <w:left w:val="single" w:sz="4" w:space="0" w:color="000000"/>
+              <w:bottom w:val="single" w:sz="4" w:space="0" w:color="000000"/>
+              <w:right w:val="single" w:sz="4" w:space="0" w:color="000000"/>
+            </w:tcBorders>
+          </w:tcPr>
+          <w:p>
+            <w:pPr>
+              <w:spacing w:after="0" w:line="259" w:lineRule="auto"/>
+              <w:ind w:left="0" w:firstLine="0"/>
+              <w:jc w:val="left"/>
+            </w:pPr>
+            <w:r>
+              <w:t xml:space="preserve">Sanctioned Capacity of solar PV system (KW) Installed </w:t>
+            </w:r>
+          </w:p>
+        </w:tc>
+        <w:tc>
+          <w:tcPr>
+            <w:tcW w:w="3047" w:type="dxa"/>
+            <w:tcBorders>
+              <w:top w:val="single" w:sz="4" w:space="0" w:color="000000"/>
+              <w:left w:val="single" w:sz="4" w:space="0" w:color="000000"/>
+              <w:bottom w:val="single" w:sz="4" w:space="0" w:color="000000"/>
+              <w:right w:val="single" w:sz="4" w:space="0" w:color="000000"/>
+            </w:tcBorders>
+          </w:tcPr>
+          <w:p>
+            <w:pPr>
+              <w:spacing w:after="0" w:line="259" w:lineRule="auto"/>
+              <w:ind w:left="0" w:firstLine="0"/>
+              <w:jc w:val="left"/>
+            </w:pPr>
+            <w:r>
+              <w:t>{{</w:t>
+            </w:r>
+            <w:proofErr w:type="spellStart"/>
+            <w:r>
+              <w:t>sanctioned_capacity</w:t>
+            </w:r>
+            <w:proofErr w:type="spellEnd"/>
+            <w:r>
+              <w:t>}}</w:t>
+            </w:r>
+          </w:p>
+        </w:tc>
+      </w:tr>
+      <w:tr>
+        <w:trPr>
+          <w:trHeight w:val="358"/>
+        </w:trPr>
+        <w:tc>
+          <w:tcPr>
+            <w:tcW w:w="0" w:type="auto"/>
+            <w:vMerge/>
+            <w:tcBorders>
+              <w:top w:val="nil"/>
+              <w:left w:val="single" w:sz="4" w:space="0" w:color="000000"/>
+              <w:bottom w:val="single" w:sz="4" w:space="0" w:color="000000"/>
+              <w:right w:val="single" w:sz="4" w:space="0" w:color="000000"/>
+            </w:tcBorders>
+          </w:tcPr>
+          <w:p>
+            <w:pPr>
+              <w:spacing w:after="160" w:line="259" w:lineRule="auto"/>
+              <w:ind w:left="0" w:firstLine="0"/>
+              <w:jc w:val="left"/>
+            </w:pPr>
+          </w:p>
+        </w:tc>
+        <w:tc>
+          <w:tcPr>
+            <w:tcW w:w="5823" w:type="dxa"/>
+            <w:tcBorders>
+              <w:top w:val="single" w:sz="4" w:space="0" w:color="000000"/>
+              <w:left w:val="single" w:sz="4" w:space="0" w:color="000000"/>
+              <w:bottom w:val="single" w:sz="4" w:space="0" w:color="000000"/>
+              <w:right w:val="single" w:sz="4" w:space="0" w:color="000000"/>
+            </w:tcBorders>
+          </w:tcPr>
+          <w:p>
+            <w:pPr>
+              <w:spacing w:after="0" w:line="259" w:lineRule="auto"/>
+              <w:ind w:left="0" w:firstLine="0"/>
+              <w:jc w:val="left"/>
+            </w:pPr>
+            <w:r>
+              <w:t xml:space="preserve">Capacity of solar PV system (KW) </w:t>
+            </w:r>
+          </w:p>
+        </w:tc>
+        <w:tc>
+          <w:tcPr>
+            <w:tcW w:w="3047" w:type="dxa"/>
+            <w:tcBorders>
+              <w:top w:val="single" w:sz="4" w:space="0" w:color="000000"/>
+              <w:left w:val="single" w:sz="4" w:space="0" w:color="000000"/>
+              <w:bottom w:val="single" w:sz="4" w:space="0" w:color="000000"/>
+              <w:right w:val="single" w:sz="4" w:space="0" w:color="000000"/>
+            </w:tcBorders>
+          </w:tcPr>
+          <w:p>
+            <w:pPr>
+              <w:spacing w:after="0" w:line="259" w:lineRule="auto"/>
+              <w:ind w:left="0" w:firstLine="0"/>
+              <w:jc w:val="left"/>
+            </w:pPr>
+            <w:r>
+              <w:t>{{capacity}}</w:t>
+            </w:r>
+          </w:p>
+        </w:tc>
+      </w:tr>
+      <w:tr>
+        <w:trPr>
           <w:trHeight w:val="380"/>
         </w:trPr>
         <w:tc>
@@ -563,7 +783,7 @@
               <w:jc w:val="left"/>
             </w:pPr>
             <w:r>
-              <w:t xml:space="preserve">ALMM Model Number </w:t>
+              <w:t xml:space="preserve">Make of Module </w:t>
             </w:r>
           </w:p>
         </w:tc>
@@ -584,48 +804,15 @@
               <w:jc w:val="left"/>
             </w:pPr>
             <w:r>
-              <w:t>{#modules}</w:t>
-            </w:r>
-          </w:p>
-          <w:p>
-            <w:pPr>
-              <w:spacing w:after="0" w:line="259" w:lineRule="auto"/>
-              <w:ind w:left="0" w:firstLine="0"/>
-              <w:jc w:val="left"/>
-            </w:pPr>
-            <w:r>
-              <w:t>Serial No: {{</w:t>
+              <w:t>{{</w:t>
             </w:r>
             <w:proofErr w:type="spellStart"/>
             <w:r>
-              <w:t>serial_number</w:t>
+              <w:t>module_make</w:t>
             </w:r>
             <w:proofErr w:type="spellEnd"/>
-            <w:proofErr w:type="gramStart"/>
-            <w:r>
-              <w:t xml:space="preserve">}}   </w:t>
-            </w:r>
-            <w:proofErr w:type="gramEnd"/>
-            <w:r>
-              <w:t>|   ALMM Model: {{</w:t>
-            </w:r>
-            <w:proofErr w:type="spellStart"/>
-            <w:r>
-              <w:t>almm_number</w:t>
-            </w:r>
-            <w:proofErr w:type="spellEnd"/>
             <w:r>
               <w:t>}}</w:t>
-            </w:r>
-          </w:p>
-          <w:p>
-            <w:pPr>
-              <w:spacing w:after="0" w:line="259" w:lineRule="auto"/>
-              <w:ind w:left="0" w:firstLine="0"/>
-              <w:jc w:val="left"/>
-            </w:pPr>
-            <w:r>
-              <w:t>{/modules}</w:t>
             </w:r>
           </w:p>
         </w:tc>
@@ -670,7 +857,7 @@
               <w:jc w:val="left"/>
             </w:pPr>
             <w:r>
-              <w:t xml:space="preserve">Wattage per module </w:t>
+              <w:t xml:space="preserve">ALMM Model Number </w:t>
             </w:r>
           </w:p>
         </w:tc>
@@ -687,18 +874,52 @@
           <w:p>
             <w:pPr>
               <w:spacing w:after="0" w:line="259" w:lineRule="auto"/>
-              <w:jc w:val="left"/>
-            </w:pPr>
-            <w:r>
-              <w:t>{{</w:t>
+              <w:ind w:left="0" w:firstLine="0"/>
+              <w:jc w:val="left"/>
+            </w:pPr>
+            <w:r>
+              <w:t>{#modules}</w:t>
+            </w:r>
+          </w:p>
+          <w:p>
+            <w:pPr>
+              <w:spacing w:after="0" w:line="259" w:lineRule="auto"/>
+              <w:ind w:left="0" w:firstLine="0"/>
+              <w:jc w:val="left"/>
+            </w:pPr>
+            <w:r>
+              <w:t>Serial No: {{</w:t>
             </w:r>
             <w:proofErr w:type="spellStart"/>
             <w:r>
-              <w:t>module_capacity</w:t>
+              <w:t>serial_number</w:t>
             </w:r>
             <w:proofErr w:type="spellEnd"/>
+            <w:proofErr w:type="gramStart"/>
+            <w:r>
+              <w:t xml:space="preserve">}}   </w:t>
+            </w:r>
+            <w:proofErr w:type="gramEnd"/>
+            <w:r>
+              <w:t>|   ALMM Model: {{</w:t>
+            </w:r>
+            <w:proofErr w:type="spellStart"/>
+            <w:r>
+              <w:t>almm_number</w:t>
+            </w:r>
+            <w:proofErr w:type="spellEnd"/>
             <w:r>
               <w:t>}}</w:t>
+            </w:r>
+          </w:p>
+          <w:p>
+            <w:pPr>
+              <w:spacing w:after="0" w:line="259" w:lineRule="auto"/>
+              <w:ind w:left="0" w:firstLine="0"/>
+              <w:jc w:val="left"/>
+            </w:pPr>
+            <w:r>
+              <w:t>{/modules}</w:t>
             </w:r>
           </w:p>
         </w:tc>
@@ -743,7 +964,7 @@
               <w:jc w:val="left"/>
             </w:pPr>
             <w:r>
-              <w:t xml:space="preserve">No. of Module </w:t>
+              <w:t xml:space="preserve">Wattage per module </w:t>
             </w:r>
           </w:p>
         </w:tc>
@@ -760,7 +981,6 @@
           <w:p>
             <w:pPr>
               <w:spacing w:after="0" w:line="259" w:lineRule="auto"/>
-              <w:ind w:left="0" w:firstLine="0"/>
               <w:jc w:val="left"/>
             </w:pPr>
             <w:r>
@@ -768,7 +988,7 @@
             </w:r>
             <w:proofErr w:type="spellStart"/>
             <w:r>
-              <w:t>module_count</w:t>
+              <w:t>module_capacity</w:t>
             </w:r>
             <w:proofErr w:type="spellEnd"/>
             <w:r>
@@ -817,7 +1037,7 @@
               <w:jc w:val="left"/>
             </w:pPr>
             <w:r>
-              <w:t xml:space="preserve">Total Capacity (KWP) </w:t>
+              <w:t xml:space="preserve">No. of Module </w:t>
             </w:r>
           </w:p>
         </w:tc>
@@ -842,7 +1062,7 @@
             </w:r>
             <w:proofErr w:type="spellStart"/>
             <w:r>
-              <w:t>total_capacity</w:t>
+              <w:t>module_count</w:t>
             </w:r>
             <w:proofErr w:type="spellEnd"/>
             <w:r>
@@ -862,6 +1082,80 @@
             <w:tcBorders>
               <w:top w:val="nil"/>
               <w:left w:val="single" w:sz="4" w:space="0" w:color="000000"/>
+              <w:bottom w:val="nil"/>
+              <w:right w:val="single" w:sz="4" w:space="0" w:color="000000"/>
+            </w:tcBorders>
+          </w:tcPr>
+          <w:p>
+            <w:pPr>
+              <w:spacing w:after="160" w:line="259" w:lineRule="auto"/>
+              <w:ind w:left="0" w:firstLine="0"/>
+              <w:jc w:val="left"/>
+            </w:pPr>
+          </w:p>
+        </w:tc>
+        <w:tc>
+          <w:tcPr>
+            <w:tcW w:w="5823" w:type="dxa"/>
+            <w:tcBorders>
+              <w:top w:val="single" w:sz="4" w:space="0" w:color="000000"/>
+              <w:left w:val="single" w:sz="4" w:space="0" w:color="000000"/>
+              <w:bottom w:val="single" w:sz="4" w:space="0" w:color="000000"/>
+              <w:right w:val="single" w:sz="4" w:space="0" w:color="000000"/>
+            </w:tcBorders>
+          </w:tcPr>
+          <w:p>
+            <w:pPr>
+              <w:spacing w:after="0" w:line="259" w:lineRule="auto"/>
+              <w:ind w:left="0" w:firstLine="0"/>
+              <w:jc w:val="left"/>
+            </w:pPr>
+            <w:r>
+              <w:t xml:space="preserve">Total Capacity (KWP) </w:t>
+            </w:r>
+          </w:p>
+        </w:tc>
+        <w:tc>
+          <w:tcPr>
+            <w:tcW w:w="3047" w:type="dxa"/>
+            <w:tcBorders>
+              <w:top w:val="single" w:sz="4" w:space="0" w:color="000000"/>
+              <w:left w:val="single" w:sz="4" w:space="0" w:color="000000"/>
+              <w:bottom w:val="single" w:sz="4" w:space="0" w:color="000000"/>
+              <w:right w:val="single" w:sz="4" w:space="0" w:color="000000"/>
+            </w:tcBorders>
+          </w:tcPr>
+          <w:p>
+            <w:pPr>
+              <w:spacing w:after="0" w:line="259" w:lineRule="auto"/>
+              <w:ind w:left="0" w:firstLine="0"/>
+              <w:jc w:val="left"/>
+            </w:pPr>
+            <w:r>
+              <w:t>{{</w:t>
+            </w:r>
+            <w:proofErr w:type="spellStart"/>
+            <w:r>
+              <w:t>total_capacity</w:t>
+            </w:r>
+            <w:proofErr w:type="spellEnd"/>
+            <w:r>
+              <w:t>}}</w:t>
+            </w:r>
+          </w:p>
+        </w:tc>
+      </w:tr>
+      <w:tr>
+        <w:trPr>
+          <w:trHeight w:val="278"/>
+        </w:trPr>
+        <w:tc>
+          <w:tcPr>
+            <w:tcW w:w="0" w:type="auto"/>
+            <w:vMerge/>
+            <w:tcBorders>
+              <w:top w:val="nil"/>
+              <w:left w:val="single" w:sz="4" w:space="0" w:color="000000"/>
               <w:bottom w:val="single" w:sz="4" w:space="0" w:color="000000"/>
               <w:right w:val="single" w:sz="4" w:space="0" w:color="000000"/>
             </w:tcBorders>
@@ -1320,6 +1614,80 @@
       </w:tr>
       <w:tr>
         <w:trPr>
+          <w:trHeight w:val="281"/>
+        </w:trPr>
+        <w:tc>
+          <w:tcPr>
+            <w:tcW w:w="0" w:type="auto"/>
+            <w:vMerge/>
+            <w:tcBorders>
+              <w:top w:val="nil"/>
+              <w:left w:val="single" w:sz="4" w:space="0" w:color="000000"/>
+              <w:bottom w:val="single" w:sz="4" w:space="0" w:color="000000"/>
+              <w:right w:val="single" w:sz="4" w:space="0" w:color="000000"/>
+            </w:tcBorders>
+          </w:tcPr>
+          <w:p>
+            <w:pPr>
+              <w:spacing w:after="160" w:line="259" w:lineRule="auto"/>
+              <w:ind w:left="0" w:firstLine="0"/>
+              <w:jc w:val="left"/>
+            </w:pPr>
+          </w:p>
+        </w:tc>
+        <w:tc>
+          <w:tcPr>
+            <w:tcW w:w="5823" w:type="dxa"/>
+            <w:tcBorders>
+              <w:top w:val="single" w:sz="4" w:space="0" w:color="000000"/>
+              <w:left w:val="single" w:sz="4" w:space="0" w:color="000000"/>
+              <w:bottom w:val="single" w:sz="4" w:space="0" w:color="000000"/>
+              <w:right w:val="single" w:sz="4" w:space="0" w:color="000000"/>
+            </w:tcBorders>
+          </w:tcPr>
+          <w:p>
+            <w:pPr>
+              <w:spacing w:after="0" w:line="259" w:lineRule="auto"/>
+              <w:ind w:left="0" w:firstLine="0"/>
+              <w:jc w:val="left"/>
+            </w:pPr>
+            <w:r>
+              <w:t xml:space="preserve">Year of manufacturing </w:t>
+            </w:r>
+          </w:p>
+        </w:tc>
+        <w:tc>
+          <w:tcPr>
+            <w:tcW w:w="3047" w:type="dxa"/>
+            <w:tcBorders>
+              <w:top w:val="single" w:sz="4" w:space="0" w:color="000000"/>
+              <w:left w:val="single" w:sz="4" w:space="0" w:color="000000"/>
+              <w:bottom w:val="single" w:sz="4" w:space="0" w:color="000000"/>
+              <w:right w:val="single" w:sz="4" w:space="0" w:color="000000"/>
+            </w:tcBorders>
+          </w:tcPr>
+          <w:p>
+            <w:pPr>
+              <w:spacing w:after="0" w:line="259" w:lineRule="auto"/>
+              <w:ind w:left="0" w:firstLine="0"/>
+              <w:jc w:val="left"/>
+            </w:pPr>
+            <w:r>
+              <w:t>{{</w:t>
+            </w:r>
+            <w:proofErr w:type="spellStart"/>
+            <w:r>
+              <w:t>inverter_yom</w:t>
+            </w:r>
+            <w:proofErr w:type="spellEnd"/>
+            <w:r>
+              <w:t>}}</w:t>
+            </w:r>
+          </w:p>
+        </w:tc>
+      </w:tr>
+      <w:tr>
+        <w:trPr>
           <w:trHeight w:val="377"/>
         </w:trPr>
         <w:tc>
@@ -1364,6 +1732,88 @@
             </w:pPr>
             <w:r>
               <w:t>Earthing and Protections</w:t>
+            </w:r>
+          </w:p>
+        </w:tc>
+      </w:tr>
+      <w:tr>
+        <w:trPr>
+          <w:trHeight w:val="420"/>
+        </w:trPr>
+        <w:tc>
+          <w:tcPr>
+            <w:tcW w:w="0" w:type="auto"/>
+            <w:vMerge/>
+            <w:tcBorders>
+              <w:top w:val="nil"/>
+              <w:left w:val="single" w:sz="4" w:space="0" w:color="000000"/>
+              <w:bottom w:val="nil"/>
+              <w:right w:val="single" w:sz="4" w:space="0" w:color="000000"/>
+            </w:tcBorders>
+          </w:tcPr>
+          <w:p>
+            <w:pPr>
+              <w:spacing w:after="160" w:line="259" w:lineRule="auto"/>
+              <w:ind w:left="0" w:firstLine="0"/>
+              <w:jc w:val="left"/>
+            </w:pPr>
+          </w:p>
+        </w:tc>
+        <w:tc>
+          <w:tcPr>
+            <w:tcW w:w="5823" w:type="dxa"/>
+            <w:tcBorders>
+              <w:top w:val="single" w:sz="4" w:space="0" w:color="000000"/>
+              <w:left w:val="single" w:sz="4" w:space="0" w:color="000000"/>
+              <w:bottom w:val="single" w:sz="4" w:space="0" w:color="000000"/>
+              <w:right w:val="single" w:sz="4" w:space="0" w:color="000000"/>
+            </w:tcBorders>
+          </w:tcPr>
+          <w:p>
+            <w:pPr>
+              <w:spacing w:after="0" w:line="259" w:lineRule="auto"/>
+              <w:ind w:left="0" w:firstLine="0"/>
+              <w:jc w:val="left"/>
+            </w:pPr>
+            <w:r>
+              <w:t xml:space="preserve">No of Separate </w:t>
+            </w:r>
+            <w:proofErr w:type="spellStart"/>
+            <w:r>
+              <w:t>Earthings</w:t>
+            </w:r>
+            <w:proofErr w:type="spellEnd"/>
+            <w:r>
+              <w:t xml:space="preserve"> with earth Resistance </w:t>
+            </w:r>
+          </w:p>
+        </w:tc>
+        <w:tc>
+          <w:tcPr>
+            <w:tcW w:w="3047" w:type="dxa"/>
+            <w:tcBorders>
+              <w:top w:val="single" w:sz="4" w:space="0" w:color="000000"/>
+              <w:left w:val="single" w:sz="4" w:space="0" w:color="000000"/>
+              <w:bottom w:val="single" w:sz="4" w:space="0" w:color="000000"/>
+              <w:right w:val="single" w:sz="4" w:space="0" w:color="000000"/>
+            </w:tcBorders>
+          </w:tcPr>
+          <w:p>
+            <w:pPr>
+              <w:spacing w:after="0" w:line="259" w:lineRule="auto"/>
+              <w:ind w:left="0" w:firstLine="0"/>
+              <w:jc w:val="left"/>
+            </w:pPr>
+            <w:r>
+              <w:t>{{</w:t>
+            </w:r>
+            <w:proofErr w:type="spellStart"/>
+            <w:r>
+              <w:t>earthings_details</w:t>
+            </w:r>
+            <w:proofErr w:type="spellEnd"/>
+            <w:r>
+              <w:t>}}</w:t>
             </w:r>
           </w:p>
         </w:tc>
@@ -1602,7 +2052,11 @@
         <w:t xml:space="preserve"> </w:t>
       </w:r>
       <w:r>
-        <w:t xml:space="preserve">Ensured structural stability of installed solar power plant and obtained requisite permissions from the concerned authority. If in future, by virtue of any means due to collapsing or damage to installed solar power plant, MSEDCL will not be held responsible for any loss to property or human life, if any. </w:t>
+        <w:t xml:space="preserve">Ensured structural stability of installed solar power plant and obtained requisite permissions from </w:t>
+      </w:r>
+      <w:r>
+        <w:lastRenderedPageBreak/>
+        <w:t xml:space="preserve">the concerned authority. If in future, by virtue of any means due to collapsing or damage to installed solar power plant, MSEDCL will not be held responsible for any loss to property or human life, if any. </w:t>
       </w:r>
     </w:p>
     <w:p>
@@ -1614,45 +2068,8 @@
       <w:pPr>
         <w:ind w:left="-5"/>
       </w:pPr>
-    </w:p>
-    <w:p>
-      <w:pPr>
-        <w:ind w:left="-5"/>
-      </w:pPr>
-    </w:p>
-    <w:p>
-      <w:pPr>
-        <w:ind w:left="-5"/>
-      </w:pPr>
-      <w:r>
-        <w:t xml:space="preserve">This is to Certified above Installed Solar PV System is working properly with electrical safety &amp; Islanding switch in case of any presence of backup inverter an arrangement should be made in such way the </w:t>
-      </w:r>
-      <w:r>
-        <w:lastRenderedPageBreak/>
-        <w:t xml:space="preserve">backup inverter supply should never be synchronized with solar inverter to avoid any electrical accident due to back feeding. We will be held responsible for non-working of islanding mechanism and back feed to the de-energized grid. </w:t>
-      </w:r>
-    </w:p>
-    <w:p>
-      <w:pPr>
-        <w:spacing w:after="199" w:line="276" w:lineRule="auto"/>
-        <w:ind w:left="0" w:firstLine="0"/>
-        <w:jc w:val="left"/>
-      </w:pPr>
-      <w:r>
-        <w:t>Guarantee Certificate Undertaking to be submitted by VENDO</w:t>
-      </w:r>
-      <w:r>
-        <w:t>R</w:t>
-      </w:r>
-    </w:p>
-    <w:p>
-      <w:pPr>
-        <w:spacing w:after="199" w:line="276" w:lineRule="auto"/>
-        <w:ind w:left="0" w:firstLine="0"/>
-        <w:jc w:val="left"/>
-      </w:pPr>
-      <w:r>
-        <w:t xml:space="preserve">The undersigned will provide the services to the consumers for repairs/maintenance of the RTS plant free of cost for 5 years of the comprehensive Maintenance Contract (CMC) period from the date of commissioning of the plant. Non performing/under-performing system component will be replaced/repaired free of cost in the CMC period </w:t>
+      <w:r>
+        <w:t xml:space="preserve">This is to Certified above Installed Solar PV System is working properly with electrical safety &amp; Islanding switch in case of any presence of backup inverter an arrangement should be made in such way the backup inverter supply should never be synchronized with solar inverter to avoid any electrical accident due to back feeding. We will be held responsible for non-working of islanding mechanism and back feed to the de-energized grid. </w:t>
       </w:r>
     </w:p>
     <w:p>
@@ -1673,7 +2090,7 @@
           <w:noProof/>
         </w:rPr>
         <w:drawing>
-          <wp:anchor distT="0" distB="0" distL="114300" distR="114300" simplePos="0" relativeHeight="251658240" behindDoc="0" locked="0" layoutInCell="1" allowOverlap="1" wp14:anchorId="0722B9F8" wp14:editId="44D75E87">
+          <wp:anchor distT="0" distB="0" distL="114300" distR="114300" simplePos="0" relativeHeight="251658240" behindDoc="0" locked="0" layoutInCell="1" allowOverlap="1" wp14:anchorId="0722B9F8" wp14:editId="5A531CEB">
             <wp:simplePos x="0" y="0"/>
             <wp:positionH relativeFrom="column">
               <wp:posOffset>-504825</wp:posOffset>
@@ -1734,6 +2151,109 @@
     </w:p>
     <w:p>
       <w:pPr>
+        <w:spacing w:after="0" w:line="276" w:lineRule="auto"/>
+        <w:ind w:left="355"/>
+        <w:jc w:val="left"/>
+      </w:pPr>
+      <w:r>
+        <w:t xml:space="preserve">                                                                                               </w:t>
+      </w:r>
+      <w:r>
+        <w:t xml:space="preserve">                 </w:t>
+      </w:r>
+      <w:r>
+        <w:t xml:space="preserve">                      </w:t>
+      </w:r>
+    </w:p>
+    <w:p>
+      <w:pPr>
+        <w:spacing w:after="0" w:line="276" w:lineRule="auto"/>
+        <w:ind w:left="355"/>
+        <w:jc w:val="left"/>
+      </w:pPr>
+      <w:r>
+        <w:t xml:space="preserve">                                                                        </w:t>
+      </w:r>
+      <w:r>
+        <w:t>{%</w:t>
+      </w:r>
+      <w:proofErr w:type="spellStart"/>
+      <w:r>
+        <w:t>consumer_signature</w:t>
+      </w:r>
+      <w:proofErr w:type="spellEnd"/>
+      <w:r>
+        <w:t>}</w:t>
+      </w:r>
+    </w:p>
+    <w:p>
+      <w:pPr>
+        <w:spacing w:after="0" w:line="276" w:lineRule="auto"/>
+        <w:ind w:left="355"/>
+        <w:jc w:val="left"/>
+      </w:pPr>
+      <w:r>
+        <w:t xml:space="preserve">  </w:t>
+      </w:r>
+      <w:r>
+        <w:t xml:space="preserve">                                                       </w:t>
+      </w:r>
+      <w:r>
+        <w:t xml:space="preserve">  _________________________________</w:t>
+      </w:r>
+    </w:p>
+    <w:p>
+      <w:pPr>
+        <w:spacing w:after="0" w:line="276" w:lineRule="auto"/>
+        <w:ind w:left="355"/>
+        <w:jc w:val="left"/>
+      </w:pPr>
+      <w:r>
+        <w:t xml:space="preserve">                   </w:t>
+      </w:r>
+    </w:p>
+    <w:p>
+      <w:pPr>
+        <w:spacing w:after="0" w:line="276" w:lineRule="auto"/>
+        <w:ind w:left="355"/>
+        <w:jc w:val="left"/>
+      </w:pPr>
+      <w:r>
+        <w:t xml:space="preserve">                    </w:t>
+      </w:r>
+      <w:r>
+        <w:t xml:space="preserve">                                                                                               </w:t>
+      </w:r>
+      <w:r>
+        <w:t>{{</w:t>
+      </w:r>
+      <w:proofErr w:type="spellStart"/>
+      <w:r>
+        <w:t>consumer_name</w:t>
+      </w:r>
+      <w:proofErr w:type="spellEnd"/>
+      <w:r>
+        <w:t>}}</w:t>
+      </w:r>
+    </w:p>
+    <w:p>
+      <w:pPr>
+        <w:ind w:left="-5"/>
+      </w:pPr>
+      <w:r>
+        <w:t xml:space="preserve">Signature [Vendor] </w:t>
+      </w:r>
+      <w:r>
+        <w:t xml:space="preserve">                                                                                                   </w:t>
+      </w:r>
+    </w:p>
+    <w:p>
+      <w:pPr>
+        <w:ind w:left="-5"/>
+      </w:pPr>
+    </w:p>
+    <w:p>
+      <w:pPr>
         <w:spacing w:after="218" w:line="259" w:lineRule="auto"/>
         <w:ind w:left="0" w:firstLine="0"/>
         <w:jc w:val="left"/>
@@ -1741,26 +2261,170 @@
     </w:p>
     <w:p>
       <w:pPr>
+        <w:spacing w:after="199" w:line="276" w:lineRule="auto"/>
+        <w:ind w:left="0" w:firstLine="0"/>
+        <w:jc w:val="left"/>
+        <w:rPr>
+          <w:b/>
+          <w:bCs/>
+        </w:rPr>
+      </w:pPr>
+      <w:r>
+        <w:rPr>
+          <w:b/>
+          <w:bCs/>
+        </w:rPr>
+        <w:t>Guarantee Certificate Undertaking to be submitted by VENDOR</w:t>
+      </w:r>
+    </w:p>
+    <w:p>
+      <w:pPr>
+        <w:spacing w:after="199" w:line="276" w:lineRule="auto"/>
+        <w:ind w:left="0" w:firstLine="0"/>
+        <w:jc w:val="left"/>
+      </w:pPr>
+      <w:r>
+        <w:t xml:space="preserve">The undersigned will provide the services to the consumers for repairs/maintenance of the RTS plant free of cost for 5 years of the comprehensive Maintenance Contract (CMC) period from the date of commissioning of the plant. Non performing/under-performing system component will be replaced/repaired free of cost in the CMC period </w:t>
+      </w:r>
+    </w:p>
+    <w:p>
+      <w:pPr>
+        <w:spacing w:after="199" w:line="276" w:lineRule="auto"/>
+        <w:ind w:left="0" w:firstLine="0"/>
+        <w:jc w:val="left"/>
+      </w:pPr>
+    </w:p>
+    <w:p>
+      <w:pPr>
+        <w:spacing w:after="199" w:line="276" w:lineRule="auto"/>
+        <w:ind w:left="0" w:firstLine="0"/>
+        <w:jc w:val="left"/>
+      </w:pPr>
+    </w:p>
+    <w:p>
+      <w:pPr>
         <w:spacing w:after="218" w:line="259" w:lineRule="auto"/>
         <w:ind w:left="0" w:firstLine="0"/>
         <w:jc w:val="left"/>
       </w:pPr>
+      <w:r>
+        <w:rPr>
+          <w:noProof/>
+        </w:rPr>
+        <w:drawing>
+          <wp:anchor distT="0" distB="0" distL="114300" distR="114300" simplePos="0" relativeHeight="251660288" behindDoc="0" locked="0" layoutInCell="1" allowOverlap="1" wp14:anchorId="4A7148C2" wp14:editId="770110B7">
+            <wp:simplePos x="0" y="0"/>
+            <wp:positionH relativeFrom="column">
+              <wp:posOffset>-504825</wp:posOffset>
+            </wp:positionH>
+            <wp:positionV relativeFrom="paragraph">
+              <wp:posOffset>72390</wp:posOffset>
+            </wp:positionV>
+            <wp:extent cx="1814013" cy="847725"/>
+            <wp:effectExtent l="0" t="0" r="0" b="0"/>
+            <wp:wrapSquare wrapText="bothSides"/>
+            <wp:docPr id="1027450686" name="Picture 1"/>
+            <wp:cNvGraphicFramePr>
+              <a:graphicFrameLocks xmlns:a="http://schemas.openxmlformats.org/drawingml/2006/main" noChangeAspect="1"/>
+            </wp:cNvGraphicFramePr>
+            <a:graphic xmlns:a="http://schemas.openxmlformats.org/drawingml/2006/main">
+              <a:graphicData uri="http://schemas.openxmlformats.org/drawingml/2006/picture">
+                <pic:pic xmlns:pic="http://schemas.openxmlformats.org/drawingml/2006/picture">
+                  <pic:nvPicPr>
+                    <pic:cNvPr id="154697283" name=""/>
+                    <pic:cNvPicPr/>
+                  </pic:nvPicPr>
+                  <pic:blipFill>
+                    <a:blip r:embed="rId5">
+                      <a:extLst>
+                        <a:ext uri="{28A0092B-C50C-407E-A947-70E740481C1C}">
+                          <a14:useLocalDpi xmlns:a14="http://schemas.microsoft.com/office/drawing/2010/main" val="0"/>
+                        </a:ext>
+                      </a:extLst>
+                    </a:blip>
+                    <a:stretch>
+                      <a:fillRect/>
+                    </a:stretch>
+                  </pic:blipFill>
+                  <pic:spPr>
+                    <a:xfrm>
+                      <a:off x="0" y="0"/>
+                      <a:ext cx="1814013" cy="847725"/>
+                    </a:xfrm>
+                    <a:prstGeom prst="rect">
+                      <a:avLst/>
+                    </a:prstGeom>
+                  </pic:spPr>
+                </pic:pic>
+              </a:graphicData>
+            </a:graphic>
+            <wp14:sizeRelH relativeFrom="page">
+              <wp14:pctWidth>0</wp14:pctWidth>
+            </wp14:sizeRelH>
+            <wp14:sizeRelV relativeFrom="page">
+              <wp14:pctHeight>0</wp14:pctHeight>
+            </wp14:sizeRelV>
+          </wp:anchor>
+        </w:drawing>
+      </w:r>
+      <w:r>
+        <w:t xml:space="preserve"> </w:t>
+      </w:r>
+    </w:p>
+    <w:p>
+      <w:pPr>
+        <w:spacing w:after="0" w:line="276" w:lineRule="auto"/>
+        <w:ind w:left="355"/>
+        <w:jc w:val="left"/>
+      </w:pPr>
+      <w:r>
+        <w:t xml:space="preserve">                                                                                                                                      </w:t>
+      </w:r>
+    </w:p>
+    <w:p>
+      <w:pPr>
+        <w:spacing w:after="0" w:line="276" w:lineRule="auto"/>
+        <w:ind w:left="355"/>
+        <w:jc w:val="left"/>
+      </w:pPr>
+    </w:p>
+    <w:p>
+      <w:pPr>
+        <w:spacing w:after="0" w:line="276" w:lineRule="auto"/>
+        <w:ind w:left="355"/>
+        <w:jc w:val="left"/>
+      </w:pPr>
+      <w:r>
+        <w:t xml:space="preserve">                   </w:t>
+      </w:r>
     </w:p>
     <w:p>
       <w:pPr>
         <w:ind w:left="-5"/>
       </w:pPr>
-      <w:r>
-        <w:t xml:space="preserve">Signature [Vendor] </w:t>
-      </w:r>
     </w:p>
     <w:p>
       <w:pPr>
         <w:ind w:left="-5"/>
       </w:pPr>
       <w:r>
+        <w:t xml:space="preserve">Signature [Vendor]                                                                                                    </w:t>
+      </w:r>
+    </w:p>
+    <w:p>
+      <w:pPr>
+        <w:ind w:left="-5"/>
+      </w:pPr>
+      <w:r>
         <w:t xml:space="preserve">Stamp &amp; Seal </w:t>
       </w:r>
+    </w:p>
+    <w:p>
+      <w:pPr>
+        <w:spacing w:after="199" w:line="276" w:lineRule="auto"/>
+        <w:ind w:left="0" w:firstLine="0"/>
+        <w:jc w:val="left"/>
+      </w:pPr>
     </w:p>
     <w:p>
       <w:pPr>
@@ -1785,9 +2449,17 @@
     </w:p>
     <w:p>
       <w:pPr>
+        <w:spacing w:after="218" w:line="259" w:lineRule="auto"/>
+        <w:ind w:left="0" w:firstLine="0"/>
+        <w:jc w:val="left"/>
+      </w:pPr>
+    </w:p>
+    <w:p>
+      <w:pPr>
         <w:ind w:left="-5"/>
       </w:pPr>
       <w:r>
+        <w:lastRenderedPageBreak/>
         <w:t xml:space="preserve">Identity Details of Consumer: - </w:t>
       </w:r>
     </w:p>
@@ -1964,7 +2636,6 @@
         <w:jc w:val="left"/>
       </w:pPr>
       <w:r>
-        <w:lastRenderedPageBreak/>
         <w:t xml:space="preserve"> </w:t>
       </w:r>
     </w:p>

</xml_diff>